<commit_message>
docs(laporan bulan-3): Rantai Lake diposisikan sebagai platform siap pakai, bukan lingkup pengembangan Dispar
Rantai Lake adalah produk platform penyedia yang sudah jadi. Lingkup kegiatan
Dispar = MENYATUKAN lake house Dinas dengannya (sambungkan ke mart Gold, susun
dashboard indikator, pakai asisten data) — bukan membangun perangkat BI/konsol.
Seluruh kalimat 'pengembangan platform lakehouse dengan Rantai Lake' diganti.

Co-Authored-By: Claude Opus 5 (1M context) <noreply@anthropic.com>
</commit_message>
<xml_diff>
--- a/report/tenaga-ahli/bulan-3/00-Laporan-Utama-Bulan-3.docx
+++ b/report/tenaga-ahli/bulan-3/00-Laporan-Utama-Bulan-3.docx
@@ -363,7 +363,7 @@
           <w:color w:val="1A1A1A"/>
           <w:sz w:val="22"/>
         </w:rPr>
-        <w:t>Laporan ini merupakan laporan bulanan ketiga atas pelaksanaan kegiatan Penyediaan dan Pengelolaan Data Statistik Pariwisata Jakarta Tahun Anggaran 2026. Bila bulan pertama difokuskan pada fondasi data dan dashboard percontohan, dan bulan kedua pada operasionalisasi platform secara mandiri serta perluasan data, maka bulan ketiga difokuskan pada penataan data di tingkat arsitektur: (1) membangun dan mengoperasikan Lake House data pariwisata tiga lapis (mentah–bersih–penyaji) yang berjalan otomatis setiap hari pada server milik Dinas, sebagai tindak lanjut arahan rapat 13 Juli 2026 mengenai kebutuhan lake house yang tetap fleksibel bila kelak dipindahkan ke basis data lain; (2) pengembangan platform lakehouse dengan Rantai Lake, yaitu konsol pengelolaan lakehouse yang sekaligus menjadi alat dashboarding — dashboard dapat disusun secara manual maupun melalui percakapan dengan asisten AI, dengan jawaban yang selalu menyertakan kueri dan sumber datanya; serta (3) memastikan seluruh tampilan data pada platform Dinas dibaca dari lake house tersebut, bukan lagi menembak layanan luar setiap kali halaman dibuka, sehingga tampilan tetap hidup meskipun layanan sumber sedang terganggu.</w:t>
+        <w:t>Laporan ini merupakan laporan bulanan ketiga atas pelaksanaan kegiatan Penyediaan dan Pengelolaan Data Statistik Pariwisata Jakarta Tahun Anggaran 2026. Bila bulan pertama difokuskan pada fondasi data dan dashboard percontohan, dan bulan kedua pada operasionalisasi platform secara mandiri serta perluasan data, maka bulan ketiga difokuskan pada penataan data di tingkat arsitektur: (1) membangun dan mengoperasikan Lake House data pariwisata tiga lapis (mentah–bersih–penyaji) yang berjalan otomatis setiap hari pada server milik Dinas, sebagai tindak lanjut arahan rapat 13 Juli 2026 mengenai kebutuhan lake house yang tetap fleksibel bila kelak dipindahkan ke basis data lain; (2) menyatukan lake house Dinas dengan Rantai Lake — platform lakehouse siap pakai milik penyedia — sebagai alat pengelolaan sekaligus alat dashboarding, sehingga dashboard dapat disusun tanpa menulis kueri, baik lewat antarmuka maupun percakapan, dengan jawaban yang selalu menyertakan kueri dan sumber datanya; serta (3) memastikan seluruh tampilan data pada platform Dinas dibaca dari lake house tersebut, bukan lagi menembak layanan luar setiap kali halaman dibuka, sehingga tampilan tetap hidup meskipun layanan sumber sedang terganggu.</w:t>
       </w:r>
     </w:p>
     <w:p>
@@ -609,7 +609,7 @@
                 <w:color w:val="1A1A1A"/>
                 <w:sz w:val="17"/>
               </w:rPr>
-              <w:t>Platform lakehouse Rantai Lake</w:t>
+              <w:t>Penyatuan dengan platform Rantai Lake</w:t>
             </w:r>
           </w:p>
         </w:tc>
@@ -626,7 +626,7 @@
                 <w:color w:val="1A1A1A"/>
                 <w:sz w:val="17"/>
               </w:rPr>
-              <w:t>Konsol pengelolaan (katalog, alur data, pemantauan) + dashboarding 19 jenis grafik + AI Copilot tanya-data</w:t>
+              <w:t>Lake house Dinas tersambung ke platform siap pakai: pengelolaan (katalog, alur data, pemantauan), dashboarding, dan asisten data — perangkatnya tidak dibangun dalam kegiatan ini</w:t>
             </w:r>
           </w:p>
         </w:tc>
@@ -643,7 +643,7 @@
                 <w:color w:val="1A1A1A"/>
                 <w:sz w:val="17"/>
               </w:rPr>
-              <w:t>Berjalan (server pengembangan)</w:t>
+              <w:t>Tersambung, uji pakai</w:t>
             </w:r>
           </w:p>
         </w:tc>
@@ -2652,7 +2652,7 @@
           <w:color w:val="555555"/>
           <w:sz w:val="18"/>
         </w:rPr>
-        <w:t>Gambar 4. Dashboarding pada platform lakehouse Rantai Lake — kartu tersusun dari mart penyaji.</w:t>
+        <w:t>Gambar 4. Dashboard indikator yang disusun di atas platform Rantai Lake — kartu membaca mart penyaji lake house Dinas.</w:t>
       </w:r>
     </w:p>
     <w:p>
@@ -3940,7 +3940,7 @@
           <w:color w:val="1A1A1A"/>
           <w:sz w:val="22"/>
         </w:rPr>
-        <w:t>Sebagai kelanjutan, tim melanjutkan pengembangan Jakarta Tourism Intelligence Platform — satu fondasi AI-Data yang menggabungkan lima kemampuan inti: Data Gathering, Lakehouse Making, Dashboarding, AI Analyst, dan Policy Insight Layer. Pada bulan ketiga ini kemampuan Lakehouse Making telah terwujud dan berjalan otomatis, kemampuan Dashboarding meningkat menjadi alat bantu mandiri bagi pengguna, dan kemampuan AI Analyst mulai berfungsi melalui asisten yang dapat menjawab pertanyaan langsung di atas data Dinas. Tahap berikutnya adalah memantapkan lapisan Policy Insight — mengubah jawaban data menjadi bahan kebijakan yang tetap dapat diaudit sampai ke baris datanya.</w:t>
+        <w:t>Sebagai kelanjutan, tim melanjutkan pengembangan Jakarta Tourism Intelligence Platform — satu fondasi AI-Data yang menggabungkan lima kemampuan inti: Data Gathering, Lakehouse Making, Dashboarding, AI Analyst, dan Policy Insight Layer. Pada bulan ketiga ini kemampuan Lakehouse Making telah terwujud dan berjalan otomatis, sedangkan kemampuan Dashboarding dan AI Analyst dipenuhi dengan menyatukan lake house Dinas dengan platform Rantai Lake yang sudah tersedia — sehingga anggaran kegiatan tidak dipakai membangun ulang perangkat yang sudah ada, melainkan untuk data dan penerapannya. Tahap berikutnya adalah memantapkan lapisan Policy Insight — mengubah jawaban data menjadi bahan kebijakan yang tetap dapat diaudit sampai ke baris datanya.</w:t>
       </w:r>
     </w:p>
     <w:tbl>
@@ -4050,7 +4050,7 @@
                 <w:color w:val="1A1A1A"/>
                 <w:sz w:val="17"/>
               </w:rPr>
-              <w:t>Pemasangan konsol Rantai Lake di server Dinas</w:t>
+              <w:t>Pemasangan Rantai Lake di server Dinas</w:t>
             </w:r>
           </w:p>
         </w:tc>

</xml_diff>